<commit_message>
feat(quotation): add eco prime quotation generator
</commit_message>
<xml_diff>
--- a/Ho So Du An/Yeu Cau Thanh Toan/đơn yêu cầu thanh toán - CÔNG TY TNHH CÔNG NGHỆ JINXUN VIỆT NAM - HD-20261013-001.docx
+++ b/Ho So Du An/Yeu Cau Thanh Toan/đơn yêu cầu thanh toán - CÔNG TY TNHH CÔNG NGHỆ JINXUN VIỆT NAM - HD-20261013-001.docx
@@ -89,7 +89,7 @@
           <w:color w:val="000000"/>
           <w:sz w:val="17"/>
         </w:rPr>
-        <w:t>Form NO.     HMV16102026-001-SYTT</w:t>
+        <w:t>Form NO.     HMV17102026-001-SYTT</w:t>
       </w:r>
     </w:p>
     <w:tbl>
@@ -245,7 +245,7 @@
                 <w:color w:val="000000"/>
                 <w:sz w:val="19"/>
               </w:rPr>
-              <w:t>16/10/2026</w:t>
+              <w:t>17/10/2026</w:t>
             </w:r>
           </w:p>
         </w:tc>
@@ -424,6 +424,7 @@
                 <w:color w:val="000000"/>
                 <w:sz w:val="19"/>
               </w:rPr>
+              <w:t>25/10/2026</w:t>
             </w:r>
           </w:p>
         </w:tc>
@@ -957,6 +958,18 @@
               </w:rPr>
               <w:t>合約 / Hợp đồng：HD-20261013-001</w:t>
             </w:r>
+            <w:r>
+              <w:br/>
+            </w:r>
+            <w:r>
+              <w:rPr>
+                <w:rFonts w:ascii="Microsoft JhengHei" w:hAnsi="Microsoft JhengHei" w:eastAsia="Microsoft JhengHei" w:cs="Microsoft JhengHei"/>
+                <w:b w:val="0"/>
+                <w:color w:val="000000"/>
+                <w:sz w:val="14"/>
+              </w:rPr>
+              <w:t>發票 / Hóa đơn：HD-TEST-001</w:t>
+            </w:r>
           </w:p>
         </w:tc>
         <w:tc>
@@ -1265,7 +1278,7 @@
                 <w:color w:val="000000"/>
                 <w:sz w:val="16"/>
               </w:rPr>
-              <w:t>第1期付款條件達成時：支付合約金額的 35% (282.654.114 VND，越南盾貳億捌仟貳佰陸拾伍萬肆仟壹佰壹拾肆整)。待支付。</w:t>
+              <w:t>第1期付款條件達成時：支付合約金額的 35% (282.654.114 VND，越南盾貳億捌仟貳佰陸拾伍萬肆仟壹佰壹拾肆整)。 付款到期日：25/10/2026。 發票編號：HD-TEST-001。待支付。</w:t>
             </w:r>
           </w:p>
           <w:p>
@@ -1280,7 +1293,7 @@
                 <w:color w:val="000000"/>
                 <w:sz w:val="16"/>
               </w:rPr>
-              <w:t>ngay lập tức: Thanh toán 35% giá trị hợp đồng (282.654.114 VND - Hai trăm tám mươi hai triệu sáu trăm năm mươi tư nghìn một trăm mười bốn đồng chẵn.) Chưa thanh toán.</w:t>
+              <w:t>ngay lập tức: Thanh toán 35% giá trị hợp đồng (282.654.114 VND - Hai trăm tám mươi hai triệu sáu trăm năm mươi tư nghìn một trăm mười bốn đồng chẵn.) Hạn thanh toán: 25/10/2026. Hóa đơn: HD-TEST-001. Chưa thanh toán.</w:t>
             </w:r>
           </w:p>
         </w:tc>
@@ -1330,7 +1343,7 @@
                 <w:color w:val="000000"/>
                 <w:sz w:val="16"/>
               </w:rPr>
-              <w:t>60 ngày: Thanh toán 55% giá trị hợp đồng (444.170.751 VND - Bốn trăm bốn mươi tư triệu một trăm bảy mươi nghìn bảy trăm năm mươi mốt đồng chẵn.) Chưa thanh toán.</w:t>
+              <w:t>thời hạn thanh toán T/T 60 ngày: Thanh toán 55% giá trị hợp đồng (444.170.751 VND - Bốn trăm bốn mươi tư triệu một trăm bảy mươi nghìn bảy trăm năm mươi mốt đồng chẵn.) Chưa thanh toán.</w:t>
             </w:r>
           </w:p>
         </w:tc>

</xml_diff>